<commit_message>
Report: test loss and training time for every DP-SGD run, optimiser settings
Co-Authored-By: Claude Opus 5.5 <noreply@anthropic.com>
</commit_message>
<xml_diff>
--- a/report/Assignment3_Short_Report.docx
+++ b/report/Assignment3_Short_Report.docx
@@ -3690,17 +3690,19 @@
         <w:tblLook w:firstColumn="1" w:firstRow="1" w:lastColumn="0" w:lastRow="0" w:noHBand="0" w:noVBand="1" w:val="04A0"/>
       </w:tblPr>
       <w:tblGrid>
-        <w:gridCol w:w="1701"/>
-        <w:gridCol w:w="1701"/>
-        <w:gridCol w:w="1701"/>
-        <w:gridCol w:w="1701"/>
-        <w:gridCol w:w="1701"/>
-        <w:gridCol w:w="1701"/>
+        <w:gridCol w:w="1276"/>
+        <w:gridCol w:w="1276"/>
+        <w:gridCol w:w="1276"/>
+        <w:gridCol w:w="1276"/>
+        <w:gridCol w:w="1276"/>
+        <w:gridCol w:w="1276"/>
+        <w:gridCol w:w="1276"/>
+        <w:gridCol w:w="1276"/>
       </w:tblGrid>
       <w:tr>
         <w:tc>
           <w:tcPr>
-            <w:tcW w:type="dxa" w:w="1701"/>
+            <w:tcW w:type="dxa" w:w="1276"/>
             <w:shd w:val="clear" w:color="auto" w:fill="E4E3DF"/>
           </w:tcPr>
           <w:p>
@@ -3710,7 +3712,7 @@
             <w:r>
               <w:rPr>
                 <w:b/>
-                <w:sz w:val="17"/>
+                <w:sz w:val="15"/>
               </w:rPr>
               <w:t>Setting (N=60k, 20 epochs)</w:t>
             </w:r>
@@ -3718,7 +3720,7 @@
         </w:tc>
         <w:tc>
           <w:tcPr>
-            <w:tcW w:type="dxa" w:w="1701"/>
+            <w:tcW w:type="dxa" w:w="1276"/>
             <w:shd w:val="clear" w:color="auto" w:fill="E4E3DF"/>
           </w:tcPr>
           <w:p>
@@ -3728,14 +3730,14 @@
             <w:r>
               <w:rPr>
                 <w:b/>
-                <w:sz w:val="17"/>
+                <w:sz w:val="15"/>
               </w:rPr>
               <w:t>ε (δ=10</w:t>
             </w:r>
             <w:r>
               <w:rPr>
                 <w:b/>
-                <w:sz w:val="17"/>
+                <w:sz w:val="15"/>
                 <w:vertAlign w:val="superscript"/>
               </w:rPr>
               <w:t>-5</w:t>
@@ -3743,7 +3745,7 @@
             <w:r>
               <w:rPr>
                 <w:b/>
-                <w:sz w:val="17"/>
+                <w:sz w:val="15"/>
               </w:rPr>
               <w:t>)</w:t>
             </w:r>
@@ -3751,7 +3753,7 @@
         </w:tc>
         <w:tc>
           <w:tcPr>
-            <w:tcW w:type="dxa" w:w="1701"/>
+            <w:tcW w:type="dxa" w:w="1276"/>
             <w:shd w:val="clear" w:color="auto" w:fill="E4E3DF"/>
           </w:tcPr>
           <w:p>
@@ -3761,7 +3763,7 @@
             <w:r>
               <w:rPr>
                 <w:b/>
-                <w:sz w:val="17"/>
+                <w:sz w:val="15"/>
               </w:rPr>
               <w:t>Acc. % C=0.5</w:t>
             </w:r>
@@ -3769,7 +3771,7 @@
         </w:tc>
         <w:tc>
           <w:tcPr>
-            <w:tcW w:type="dxa" w:w="1701"/>
+            <w:tcW w:type="dxa" w:w="1276"/>
             <w:shd w:val="clear" w:color="auto" w:fill="E4E3DF"/>
           </w:tcPr>
           <w:p>
@@ -3779,7 +3781,7 @@
             <w:r>
               <w:rPr>
                 <w:b/>
-                <w:sz w:val="17"/>
+                <w:sz w:val="15"/>
               </w:rPr>
               <w:t>C=2</w:t>
             </w:r>
@@ -3787,7 +3789,7 @@
         </w:tc>
         <w:tc>
           <w:tcPr>
-            <w:tcW w:type="dxa" w:w="1701"/>
+            <w:tcW w:type="dxa" w:w="1276"/>
             <w:shd w:val="clear" w:color="auto" w:fill="E4E3DF"/>
           </w:tcPr>
           <w:p>
@@ -3797,7 +3799,7 @@
             <w:r>
               <w:rPr>
                 <w:b/>
-                <w:sz w:val="17"/>
+                <w:sz w:val="15"/>
               </w:rPr>
               <w:t>C=8</w:t>
             </w:r>
@@ -3805,7 +3807,7 @@
         </w:tc>
         <w:tc>
           <w:tcPr>
-            <w:tcW w:type="dxa" w:w="1701"/>
+            <w:tcW w:type="dxa" w:w="1276"/>
             <w:shd w:val="clear" w:color="auto" w:fill="E4E3DF"/>
           </w:tcPr>
           <w:p>
@@ -3815,7 +3817,43 @@
             <w:r>
               <w:rPr>
                 <w:b/>
-                <w:sz w:val="17"/>
+                <w:sz w:val="15"/>
+              </w:rPr>
+              <w:t>Test loss (C=0.5)</w:t>
+            </w:r>
+          </w:p>
+        </w:tc>
+        <w:tc>
+          <w:tcPr>
+            <w:tcW w:type="dxa" w:w="1276"/>
+            <w:shd w:val="clear" w:color="auto" w:fill="E4E3DF"/>
+          </w:tcPr>
+          <w:p>
+            <w:pPr>
+              <w:spacing w:after="0"/>
+            </w:pPr>
+            <w:r>
+              <w:rPr>
+                <w:b/>
+                <w:sz w:val="15"/>
+              </w:rPr>
+              <w:t>Train time s (C=0.5)</w:t>
+            </w:r>
+          </w:p>
+        </w:tc>
+        <w:tc>
+          <w:tcPr>
+            <w:tcW w:type="dxa" w:w="1276"/>
+            <w:shd w:val="clear" w:color="auto" w:fill="E4E3DF"/>
+          </w:tcPr>
+          <w:p>
+            <w:pPr>
+              <w:spacing w:after="0"/>
+            </w:pPr>
+            <w:r>
+              <w:rPr>
+                <w:b/>
+                <w:sz w:val="15"/>
               </w:rPr>
               <w:t>MIA AUC (C=0.5)</w:t>
             </w:r>
@@ -3825,7 +3863,7 @@
       <w:tr>
         <w:tc>
           <w:tcPr>
-            <w:tcW w:type="dxa" w:w="1701"/>
+            <w:tcW w:type="dxa" w:w="1276"/>
           </w:tcPr>
           <w:p>
             <w:pPr>
@@ -3834,7 +3872,7 @@
             <w:r>
               <w:rPr>
                 <w:b w:val="0"/>
-                <w:sz w:val="17"/>
+                <w:sz w:val="15"/>
               </w:rPr>
               <w:t>non-private</w:t>
             </w:r>
@@ -3842,7 +3880,7 @@
         </w:tc>
         <w:tc>
           <w:tcPr>
-            <w:tcW w:type="dxa" w:w="1701"/>
+            <w:tcW w:type="dxa" w:w="1276"/>
           </w:tcPr>
           <w:p>
             <w:pPr>
@@ -3851,7 +3889,7 @@
             <w:r>
               <w:rPr>
                 <w:b w:val="0"/>
-                <w:sz w:val="17"/>
+                <w:sz w:val="15"/>
               </w:rPr>
               <w:t>∞</w:t>
             </w:r>
@@ -3859,7 +3897,7 @@
         </w:tc>
         <w:tc>
           <w:tcPr>
-            <w:tcW w:type="dxa" w:w="1701"/>
+            <w:tcW w:type="dxa" w:w="1276"/>
           </w:tcPr>
           <w:p>
             <w:pPr>
@@ -3868,7 +3906,7 @@
             <w:r>
               <w:rPr>
                 <w:b w:val="0"/>
-                <w:sz w:val="17"/>
+                <w:sz w:val="15"/>
               </w:rPr>
               <w:t>91.5</w:t>
             </w:r>
@@ -3876,7 +3914,7 @@
         </w:tc>
         <w:tc>
           <w:tcPr>
-            <w:tcW w:type="dxa" w:w="1701"/>
+            <w:tcW w:type="dxa" w:w="1276"/>
           </w:tcPr>
           <w:p>
             <w:pPr>
@@ -3886,7 +3924,7 @@
         </w:tc>
         <w:tc>
           <w:tcPr>
-            <w:tcW w:type="dxa" w:w="1701"/>
+            <w:tcW w:type="dxa" w:w="1276"/>
           </w:tcPr>
           <w:p>
             <w:pPr>
@@ -3896,7 +3934,7 @@
         </w:tc>
         <w:tc>
           <w:tcPr>
-            <w:tcW w:type="dxa" w:w="1701"/>
+            <w:tcW w:type="dxa" w:w="1276"/>
           </w:tcPr>
           <w:p>
             <w:pPr>
@@ -3905,7 +3943,41 @@
             <w:r>
               <w:rPr>
                 <w:b w:val="0"/>
-                <w:sz w:val="17"/>
+                <w:sz w:val="15"/>
+              </w:rPr>
+              <w:t>0.41</w:t>
+            </w:r>
+          </w:p>
+        </w:tc>
+        <w:tc>
+          <w:tcPr>
+            <w:tcW w:type="dxa" w:w="1276"/>
+          </w:tcPr>
+          <w:p>
+            <w:pPr>
+              <w:spacing w:after="0"/>
+            </w:pPr>
+            <w:r>
+              <w:rPr>
+                <w:b w:val="0"/>
+                <w:sz w:val="15"/>
+              </w:rPr>
+              <w:t>13</w:t>
+            </w:r>
+          </w:p>
+        </w:tc>
+        <w:tc>
+          <w:tcPr>
+            <w:tcW w:type="dxa" w:w="1276"/>
+          </w:tcPr>
+          <w:p>
+            <w:pPr>
+              <w:spacing w:after="0"/>
+            </w:pPr>
+            <w:r>
+              <w:rPr>
+                <w:b w:val="0"/>
+                <w:sz w:val="15"/>
               </w:rPr>
               <w:t>0.523</w:t>
             </w:r>
@@ -3915,7 +3987,7 @@
       <w:tr>
         <w:tc>
           <w:tcPr>
-            <w:tcW w:type="dxa" w:w="1701"/>
+            <w:tcW w:type="dxa" w:w="1276"/>
           </w:tcPr>
           <w:p>
             <w:pPr>
@@ -3924,7 +3996,7 @@
             <w:r>
               <w:rPr>
                 <w:b w:val="0"/>
-                <w:sz w:val="17"/>
+                <w:sz w:val="15"/>
               </w:rPr>
               <w:t>clip only (σ=0)</w:t>
             </w:r>
@@ -3932,7 +4004,7 @@
         </w:tc>
         <w:tc>
           <w:tcPr>
-            <w:tcW w:type="dxa" w:w="1701"/>
+            <w:tcW w:type="dxa" w:w="1276"/>
           </w:tcPr>
           <w:p>
             <w:pPr>
@@ -3941,7 +4013,7 @@
             <w:r>
               <w:rPr>
                 <w:b w:val="0"/>
-                <w:sz w:val="17"/>
+                <w:sz w:val="15"/>
               </w:rPr>
               <w:t>∞</w:t>
             </w:r>
@@ -3949,7 +4021,7 @@
         </w:tc>
         <w:tc>
           <w:tcPr>
-            <w:tcW w:type="dxa" w:w="1701"/>
+            <w:tcW w:type="dxa" w:w="1276"/>
           </w:tcPr>
           <w:p>
             <w:pPr>
@@ -3958,7 +4030,7 @@
             <w:r>
               <w:rPr>
                 <w:b w:val="0"/>
-                <w:sz w:val="17"/>
+                <w:sz w:val="15"/>
               </w:rPr>
               <w:t>84.7</w:t>
             </w:r>
@@ -3966,7 +4038,7 @@
         </w:tc>
         <w:tc>
           <w:tcPr>
-            <w:tcW w:type="dxa" w:w="1701"/>
+            <w:tcW w:type="dxa" w:w="1276"/>
           </w:tcPr>
           <w:p>
             <w:pPr>
@@ -3975,7 +4047,7 @@
             <w:r>
               <w:rPr>
                 <w:b w:val="0"/>
-                <w:sz w:val="17"/>
+                <w:sz w:val="15"/>
               </w:rPr>
               <w:t>88.5</w:t>
             </w:r>
@@ -3983,7 +4055,7 @@
         </w:tc>
         <w:tc>
           <w:tcPr>
-            <w:tcW w:type="dxa" w:w="1701"/>
+            <w:tcW w:type="dxa" w:w="1276"/>
           </w:tcPr>
           <w:p>
             <w:pPr>
@@ -3992,7 +4064,7 @@
             <w:r>
               <w:rPr>
                 <w:b w:val="0"/>
-                <w:sz w:val="17"/>
+                <w:sz w:val="15"/>
               </w:rPr>
               <w:t>91.7</w:t>
             </w:r>
@@ -4000,7 +4072,7 @@
         </w:tc>
         <w:tc>
           <w:tcPr>
-            <w:tcW w:type="dxa" w:w="1701"/>
+            <w:tcW w:type="dxa" w:w="1276"/>
           </w:tcPr>
           <w:p>
             <w:pPr>
@@ -4009,7 +4081,41 @@
             <w:r>
               <w:rPr>
                 <w:b w:val="0"/>
-                <w:sz w:val="17"/>
+                <w:sz w:val="15"/>
+              </w:rPr>
+              <w:t>0.85</w:t>
+            </w:r>
+          </w:p>
+        </w:tc>
+        <w:tc>
+          <w:tcPr>
+            <w:tcW w:type="dxa" w:w="1276"/>
+          </w:tcPr>
+          <w:p>
+            <w:pPr>
+              <w:spacing w:after="0"/>
+            </w:pPr>
+            <w:r>
+              <w:rPr>
+                <w:b w:val="0"/>
+                <w:sz w:val="15"/>
+              </w:rPr>
+              <w:t>42</w:t>
+            </w:r>
+          </w:p>
+        </w:tc>
+        <w:tc>
+          <w:tcPr>
+            <w:tcW w:type="dxa" w:w="1276"/>
+          </w:tcPr>
+          <w:p>
+            <w:pPr>
+              <w:spacing w:after="0"/>
+            </w:pPr>
+            <w:r>
+              <w:rPr>
+                <w:b w:val="0"/>
+                <w:sz w:val="15"/>
               </w:rPr>
               <w:t>0.505</w:t>
             </w:r>
@@ -4019,7 +4125,7 @@
       <w:tr>
         <w:tc>
           <w:tcPr>
-            <w:tcW w:type="dxa" w:w="1701"/>
+            <w:tcW w:type="dxa" w:w="1276"/>
           </w:tcPr>
           <w:p>
             <w:pPr>
@@ -4028,7 +4134,7 @@
             <w:r>
               <w:rPr>
                 <w:b w:val="0"/>
-                <w:sz w:val="17"/>
+                <w:sz w:val="15"/>
               </w:rPr>
               <w:t>σ = 0.5</w:t>
             </w:r>
@@ -4036,7 +4142,7 @@
         </w:tc>
         <w:tc>
           <w:tcPr>
-            <w:tcW w:type="dxa" w:w="1701"/>
+            <w:tcW w:type="dxa" w:w="1276"/>
           </w:tcPr>
           <w:p>
             <w:pPr>
@@ -4045,7 +4151,7 @@
             <w:r>
               <w:rPr>
                 <w:b w:val="0"/>
-                <w:sz w:val="17"/>
+                <w:sz w:val="15"/>
               </w:rPr>
               <w:t>14.28</w:t>
             </w:r>
@@ -4053,7 +4159,7 @@
         </w:tc>
         <w:tc>
           <w:tcPr>
-            <w:tcW w:type="dxa" w:w="1701"/>
+            <w:tcW w:type="dxa" w:w="1276"/>
           </w:tcPr>
           <w:p>
             <w:pPr>
@@ -4062,7 +4168,7 @@
             <w:r>
               <w:rPr>
                 <w:b w:val="0"/>
-                <w:sz w:val="17"/>
+                <w:sz w:val="15"/>
               </w:rPr>
               <w:t>84.6</w:t>
             </w:r>
@@ -4070,7 +4176,7 @@
         </w:tc>
         <w:tc>
           <w:tcPr>
-            <w:tcW w:type="dxa" w:w="1701"/>
+            <w:tcW w:type="dxa" w:w="1276"/>
           </w:tcPr>
           <w:p>
             <w:pPr>
@@ -4079,7 +4185,7 @@
             <w:r>
               <w:rPr>
                 <w:b w:val="0"/>
-                <w:sz w:val="17"/>
+                <w:sz w:val="15"/>
               </w:rPr>
               <w:t>86.2</w:t>
             </w:r>
@@ -4087,7 +4193,7 @@
         </w:tc>
         <w:tc>
           <w:tcPr>
-            <w:tcW w:type="dxa" w:w="1701"/>
+            <w:tcW w:type="dxa" w:w="1276"/>
           </w:tcPr>
           <w:p>
             <w:pPr>
@@ -4096,7 +4202,7 @@
             <w:r>
               <w:rPr>
                 <w:b w:val="0"/>
-                <w:sz w:val="17"/>
+                <w:sz w:val="15"/>
               </w:rPr>
               <w:t>81.3</w:t>
             </w:r>
@@ -4104,7 +4210,7 @@
         </w:tc>
         <w:tc>
           <w:tcPr>
-            <w:tcW w:type="dxa" w:w="1701"/>
+            <w:tcW w:type="dxa" w:w="1276"/>
           </w:tcPr>
           <w:p>
             <w:pPr>
@@ -4113,7 +4219,41 @@
             <w:r>
               <w:rPr>
                 <w:b w:val="0"/>
-                <w:sz w:val="17"/>
+                <w:sz w:val="15"/>
+              </w:rPr>
+              <w:t>0.86</w:t>
+            </w:r>
+          </w:p>
+        </w:tc>
+        <w:tc>
+          <w:tcPr>
+            <w:tcW w:type="dxa" w:w="1276"/>
+          </w:tcPr>
+          <w:p>
+            <w:pPr>
+              <w:spacing w:after="0"/>
+            </w:pPr>
+            <w:r>
+              <w:rPr>
+                <w:b w:val="0"/>
+                <w:sz w:val="15"/>
+              </w:rPr>
+              <w:t>30</w:t>
+            </w:r>
+          </w:p>
+        </w:tc>
+        <w:tc>
+          <w:tcPr>
+            <w:tcW w:type="dxa" w:w="1276"/>
+          </w:tcPr>
+          <w:p>
+            <w:pPr>
+              <w:spacing w:after="0"/>
+            </w:pPr>
+            <w:r>
+              <w:rPr>
+                <w:b w:val="0"/>
+                <w:sz w:val="15"/>
               </w:rPr>
               <w:t>0.505</w:t>
             </w:r>
@@ -4123,7 +4263,7 @@
       <w:tr>
         <w:tc>
           <w:tcPr>
-            <w:tcW w:type="dxa" w:w="1701"/>
+            <w:tcW w:type="dxa" w:w="1276"/>
           </w:tcPr>
           <w:p>
             <w:pPr>
@@ -4132,7 +4272,7 @@
             <w:r>
               <w:rPr>
                 <w:b w:val="0"/>
-                <w:sz w:val="17"/>
+                <w:sz w:val="15"/>
               </w:rPr>
               <w:t>σ = 1</w:t>
             </w:r>
@@ -4140,7 +4280,7 @@
         </w:tc>
         <w:tc>
           <w:tcPr>
-            <w:tcW w:type="dxa" w:w="1701"/>
+            <w:tcW w:type="dxa" w:w="1276"/>
           </w:tcPr>
           <w:p>
             <w:pPr>
@@ -4149,7 +4289,7 @@
             <w:r>
               <w:rPr>
                 <w:b w:val="0"/>
-                <w:sz w:val="17"/>
+                <w:sz w:val="15"/>
               </w:rPr>
               <w:t>1.76</w:t>
             </w:r>
@@ -4157,7 +4297,7 @@
         </w:tc>
         <w:tc>
           <w:tcPr>
-            <w:tcW w:type="dxa" w:w="1701"/>
+            <w:tcW w:type="dxa" w:w="1276"/>
           </w:tcPr>
           <w:p>
             <w:pPr>
@@ -4166,7 +4306,7 @@
             <w:r>
               <w:rPr>
                 <w:b w:val="0"/>
-                <w:sz w:val="17"/>
+                <w:sz w:val="15"/>
               </w:rPr>
               <w:t>84.1</w:t>
             </w:r>
@@ -4174,7 +4314,7 @@
         </w:tc>
         <w:tc>
           <w:tcPr>
-            <w:tcW w:type="dxa" w:w="1701"/>
+            <w:tcW w:type="dxa" w:w="1276"/>
           </w:tcPr>
           <w:p>
             <w:pPr>
@@ -4183,7 +4323,7 @@
             <w:r>
               <w:rPr>
                 <w:b w:val="0"/>
-                <w:sz w:val="17"/>
+                <w:sz w:val="15"/>
               </w:rPr>
               <w:t>81.5</w:t>
             </w:r>
@@ -4191,7 +4331,7 @@
         </w:tc>
         <w:tc>
           <w:tcPr>
-            <w:tcW w:type="dxa" w:w="1701"/>
+            <w:tcW w:type="dxa" w:w="1276"/>
           </w:tcPr>
           <w:p>
             <w:pPr>
@@ -4200,7 +4340,7 @@
             <w:r>
               <w:rPr>
                 <w:b w:val="0"/>
-                <w:sz w:val="17"/>
+                <w:sz w:val="15"/>
               </w:rPr>
               <w:t>54.5</w:t>
             </w:r>
@@ -4208,7 +4348,7 @@
         </w:tc>
         <w:tc>
           <w:tcPr>
-            <w:tcW w:type="dxa" w:w="1701"/>
+            <w:tcW w:type="dxa" w:w="1276"/>
           </w:tcPr>
           <w:p>
             <w:pPr>
@@ -4217,7 +4357,41 @@
             <w:r>
               <w:rPr>
                 <w:b w:val="0"/>
-                <w:sz w:val="17"/>
+                <w:sz w:val="15"/>
+              </w:rPr>
+              <w:t>0.93</w:t>
+            </w:r>
+          </w:p>
+        </w:tc>
+        <w:tc>
+          <w:tcPr>
+            <w:tcW w:type="dxa" w:w="1276"/>
+          </w:tcPr>
+          <w:p>
+            <w:pPr>
+              <w:spacing w:after="0"/>
+            </w:pPr>
+            <w:r>
+              <w:rPr>
+                <w:b w:val="0"/>
+                <w:sz w:val="15"/>
+              </w:rPr>
+              <w:t>37</w:t>
+            </w:r>
+          </w:p>
+        </w:tc>
+        <w:tc>
+          <w:tcPr>
+            <w:tcW w:type="dxa" w:w="1276"/>
+          </w:tcPr>
+          <w:p>
+            <w:pPr>
+              <w:spacing w:after="0"/>
+            </w:pPr>
+            <w:r>
+              <w:rPr>
+                <w:b w:val="0"/>
+                <w:sz w:val="15"/>
               </w:rPr>
               <w:t>0.506</w:t>
             </w:r>
@@ -4227,7 +4401,7 @@
       <w:tr>
         <w:tc>
           <w:tcPr>
-            <w:tcW w:type="dxa" w:w="1701"/>
+            <w:tcW w:type="dxa" w:w="1276"/>
           </w:tcPr>
           <w:p>
             <w:pPr>
@@ -4236,7 +4410,7 @@
             <w:r>
               <w:rPr>
                 <w:b w:val="0"/>
-                <w:sz w:val="17"/>
+                <w:sz w:val="15"/>
               </w:rPr>
               <w:t>σ = 2</w:t>
             </w:r>
@@ -4244,7 +4418,7 @@
         </w:tc>
         <w:tc>
           <w:tcPr>
-            <w:tcW w:type="dxa" w:w="1701"/>
+            <w:tcW w:type="dxa" w:w="1276"/>
           </w:tcPr>
           <w:p>
             <w:pPr>
@@ -4253,7 +4427,7 @@
             <w:r>
               <w:rPr>
                 <w:b w:val="0"/>
-                <w:sz w:val="17"/>
+                <w:sz w:val="15"/>
               </w:rPr>
               <w:t>0.62</w:t>
             </w:r>
@@ -4261,7 +4435,7 @@
         </w:tc>
         <w:tc>
           <w:tcPr>
-            <w:tcW w:type="dxa" w:w="1701"/>
+            <w:tcW w:type="dxa" w:w="1276"/>
           </w:tcPr>
           <w:p>
             <w:pPr>
@@ -4270,7 +4444,7 @@
             <w:r>
               <w:rPr>
                 <w:b w:val="0"/>
-                <w:sz w:val="17"/>
+                <w:sz w:val="15"/>
               </w:rPr>
               <w:t>81.6</w:t>
             </w:r>
@@ -4278,7 +4452,7 @@
         </w:tc>
         <w:tc>
           <w:tcPr>
-            <w:tcW w:type="dxa" w:w="1701"/>
+            <w:tcW w:type="dxa" w:w="1276"/>
           </w:tcPr>
           <w:p>
             <w:pPr>
@@ -4287,7 +4461,7 @@
             <w:r>
               <w:rPr>
                 <w:b w:val="0"/>
-                <w:sz w:val="17"/>
+                <w:sz w:val="15"/>
               </w:rPr>
               <w:t>71.1</w:t>
             </w:r>
@@ -4295,7 +4469,7 @@
         </w:tc>
         <w:tc>
           <w:tcPr>
-            <w:tcW w:type="dxa" w:w="1701"/>
+            <w:tcW w:type="dxa" w:w="1276"/>
           </w:tcPr>
           <w:p>
             <w:pPr>
@@ -4304,7 +4478,7 @@
             <w:r>
               <w:rPr>
                 <w:b w:val="0"/>
-                <w:sz w:val="17"/>
+                <w:sz w:val="15"/>
               </w:rPr>
               <w:t>10.2</w:t>
             </w:r>
@@ -4312,7 +4486,7 @@
         </w:tc>
         <w:tc>
           <w:tcPr>
-            <w:tcW w:type="dxa" w:w="1701"/>
+            <w:tcW w:type="dxa" w:w="1276"/>
           </w:tcPr>
           <w:p>
             <w:pPr>
@@ -4321,7 +4495,41 @@
             <w:r>
               <w:rPr>
                 <w:b w:val="0"/>
-                <w:sz w:val="17"/>
+                <w:sz w:val="15"/>
+              </w:rPr>
+              <w:t>1.55</w:t>
+            </w:r>
+          </w:p>
+        </w:tc>
+        <w:tc>
+          <w:tcPr>
+            <w:tcW w:type="dxa" w:w="1276"/>
+          </w:tcPr>
+          <w:p>
+            <w:pPr>
+              <w:spacing w:after="0"/>
+            </w:pPr>
+            <w:r>
+              <w:rPr>
+                <w:b w:val="0"/>
+                <w:sz w:val="15"/>
+              </w:rPr>
+              <w:t>42</w:t>
+            </w:r>
+          </w:p>
+        </w:tc>
+        <w:tc>
+          <w:tcPr>
+            <w:tcW w:type="dxa" w:w="1276"/>
+          </w:tcPr>
+          <w:p>
+            <w:pPr>
+              <w:spacing w:after="0"/>
+            </w:pPr>
+            <w:r>
+              <w:rPr>
+                <w:b w:val="0"/>
+                <w:sz w:val="15"/>
               </w:rPr>
               <w:t>0.505</w:t>
             </w:r>
@@ -4331,7 +4539,7 @@
       <w:tr>
         <w:tc>
           <w:tcPr>
-            <w:tcW w:type="dxa" w:w="1701"/>
+            <w:tcW w:type="dxa" w:w="1276"/>
           </w:tcPr>
           <w:p>
             <w:pPr>
@@ -4340,7 +4548,7 @@
             <w:r>
               <w:rPr>
                 <w:b w:val="0"/>
-                <w:sz w:val="17"/>
+                <w:sz w:val="15"/>
               </w:rPr>
               <w:t>σ = 4</w:t>
             </w:r>
@@ -4348,7 +4556,7 @@
         </w:tc>
         <w:tc>
           <w:tcPr>
-            <w:tcW w:type="dxa" w:w="1701"/>
+            <w:tcW w:type="dxa" w:w="1276"/>
           </w:tcPr>
           <w:p>
             <w:pPr>
@@ -4357,7 +4565,7 @@
             <w:r>
               <w:rPr>
                 <w:b w:val="0"/>
-                <w:sz w:val="17"/>
+                <w:sz w:val="15"/>
               </w:rPr>
               <w:t>0.27</w:t>
             </w:r>
@@ -4365,7 +4573,7 @@
         </w:tc>
         <w:tc>
           <w:tcPr>
-            <w:tcW w:type="dxa" w:w="1701"/>
+            <w:tcW w:type="dxa" w:w="1276"/>
           </w:tcPr>
           <w:p>
             <w:pPr>
@@ -4374,7 +4582,7 @@
             <w:r>
               <w:rPr>
                 <w:b w:val="0"/>
-                <w:sz w:val="17"/>
+                <w:sz w:val="15"/>
               </w:rPr>
               <w:t>73.4</w:t>
             </w:r>
@@ -4382,7 +4590,7 @@
         </w:tc>
         <w:tc>
           <w:tcPr>
-            <w:tcW w:type="dxa" w:w="1701"/>
+            <w:tcW w:type="dxa" w:w="1276"/>
           </w:tcPr>
           <w:p>
             <w:pPr>
@@ -4391,7 +4599,7 @@
             <w:r>
               <w:rPr>
                 <w:b w:val="0"/>
-                <w:sz w:val="17"/>
+                <w:sz w:val="15"/>
               </w:rPr>
               <w:t>50.9</w:t>
             </w:r>
@@ -4399,7 +4607,7 @@
         </w:tc>
         <w:tc>
           <w:tcPr>
-            <w:tcW w:type="dxa" w:w="1701"/>
+            <w:tcW w:type="dxa" w:w="1276"/>
           </w:tcPr>
           <w:p>
             <w:pPr>
@@ -4408,7 +4616,7 @@
             <w:r>
               <w:rPr>
                 <w:b w:val="0"/>
-                <w:sz w:val="17"/>
+                <w:sz w:val="15"/>
               </w:rPr>
               <w:t>27.1</w:t>
             </w:r>
@@ -4416,7 +4624,7 @@
         </w:tc>
         <w:tc>
           <w:tcPr>
-            <w:tcW w:type="dxa" w:w="1701"/>
+            <w:tcW w:type="dxa" w:w="1276"/>
           </w:tcPr>
           <w:p>
             <w:pPr>
@@ -4425,7 +4633,41 @@
             <w:r>
               <w:rPr>
                 <w:b w:val="0"/>
-                <w:sz w:val="17"/>
+                <w:sz w:val="15"/>
+              </w:rPr>
+              <w:t>5.52</w:t>
+            </w:r>
+          </w:p>
+        </w:tc>
+        <w:tc>
+          <w:tcPr>
+            <w:tcW w:type="dxa" w:w="1276"/>
+          </w:tcPr>
+          <w:p>
+            <w:pPr>
+              <w:spacing w:after="0"/>
+            </w:pPr>
+            <w:r>
+              <w:rPr>
+                <w:b w:val="0"/>
+                <w:sz w:val="15"/>
+              </w:rPr>
+              <w:t>52</w:t>
+            </w:r>
+          </w:p>
+        </w:tc>
+        <w:tc>
+          <w:tcPr>
+            <w:tcW w:type="dxa" w:w="1276"/>
+          </w:tcPr>
+          <w:p>
+            <w:pPr>
+              <w:spacing w:after="0"/>
+            </w:pPr>
+            <w:r>
+              <w:rPr>
+                <w:b w:val="0"/>
+                <w:sz w:val="15"/>
               </w:rPr>
               <w:t>0.506</w:t>
             </w:r>
@@ -4562,6 +4804,36 @@
       <w:r>
         <w:rPr/>
         <w:t xml:space="preserve"> (C = 2 best at σ = 0.5, C = 0.5 for σ ≥ 1).</w:t>
+      </w:r>
+    </w:p>
+    <w:p>
+      <w:pPr>
+        <w:pStyle w:val="ListBullet"/>
+      </w:pPr>
+      <w:r>
+        <w:rPr>
+          <w:b/>
+        </w:rPr>
+        <w:t>Test loss</w:t>
+      </w:r>
+      <w:r>
+        <w:rPr/>
+        <w:t xml:space="preserve"> rises with noise (0.41 non-private → 0.93 at σ = 1 → 5.52 at σ = 4, C = 0.5): noisy models become poorly calibrated.</w:t>
+      </w:r>
+    </w:p>
+    <w:p>
+      <w:pPr>
+        <w:pStyle w:val="ListBullet"/>
+      </w:pPr>
+      <w:r>
+        <w:rPr>
+          <w:b/>
+        </w:rPr>
+        <w:t>Training time:</w:t>
+      </w:r>
+      <w:r>
+        <w:rPr/>
+        <w:t xml:space="preserve"> 12.5 s for the non-private model vs 21–57 s for DP (1.7–4.6× slower), because every example's gradient is computed and clipped separately. Optimiser for all runs: SGD, lr 0.05, momentum 0.9, batch 256, 20 epochs.</w:t>
       </w:r>
     </w:p>
     <w:p>

</xml_diff>